<commit_message>
Refine application features and supporting implementation
</commit_message>
<xml_diff>
--- a/DOCUMENT ESR/COMPTE_RENDU REUNION_ESR_ (2).docx
+++ b/DOCUMENT ESR/COMPTE_RENDU REUNION_ESR_ (2).docx
@@ -1,6 +1,6 @@
 
 <file path=word/document.xml><?xml version="1.0" encoding="utf-8"?>
-<w:document xmlns:wpc="http://schemas.microsoft.com/office/word/2010/wordprocessingCanvas" xmlns:cx="http://schemas.microsoft.com/office/drawing/2014/chartex" xmlns:cx1="http://schemas.microsoft.com/office/drawing/2015/9/8/chartex" xmlns:cx2="http://schemas.microsoft.com/office/drawing/2015/10/21/chartex" xmlns:cx3="http://schemas.microsoft.com/office/drawing/2016/5/9/chartex" xmlns:cx4="http://schemas.microsoft.com/office/drawing/2016/5/10/chartex" xmlns:cx5="http://schemas.microsoft.com/office/drawing/2016/5/11/chartex" xmlns:cx6="http://schemas.microsoft.com/office/drawing/2016/5/12/chartex" xmlns:cx7="http://schemas.microsoft.com/office/drawing/2016/5/13/chartex" xmlns:cx8="http://schemas.microsoft.com/office/drawing/2016/5/14/chartex" xmlns:mc="http://schemas.openxmlformats.org/markup-compatibility/2006" xmlns:aink="http://schemas.microsoft.com/office/drawing/2016/ink" xmlns:am3d="http://schemas.microsoft.com/office/drawing/2017/model3d" xmlns:o="urn:schemas-microsoft-com:office:office" xmlns:oel="http://schemas.microsoft.com/office/2019/extlst" xmlns:r="http://schemas.openxmlformats.org/officeDocument/2006/relationships" xmlns:m="http://schemas.openxmlformats.org/officeDocument/2006/math" xmlns:v="urn:schemas-microsoft-com:vml" xmlns:wp14="http://schemas.microsoft.com/office/word/2010/wordprocessingDrawing" xmlns:wp="http://schemas.openxmlformats.org/drawingml/2006/wordprocessingDrawing" xmlns:w10="urn:schemas-microsoft-com:office:word" xmlns:w="http://schemas.openxmlformats.org/wordprocessingml/2006/main" xmlns:w14="http://schemas.microsoft.com/office/word/2010/wordml" xmlns:w15="http://schemas.microsoft.com/office/word/2012/wordml" xmlns:w16cex="http://schemas.microsoft.com/office/word/2018/wordml/cex" xmlns:w16cid="http://schemas.microsoft.com/office/word/2016/wordml/cid" xmlns:w16="http://schemas.microsoft.com/office/word/2018/wordml" xmlns:w16du="http://schemas.microsoft.com/office/word/2023/wordml/word16du" xmlns:w16sdtdh="http://schemas.microsoft.com/office/word/2020/wordml/sdtdatahash" xmlns:w16sdtfl="http://schemas.microsoft.com/office/word/2024/wordml/sdtformatlock" xmlns:w16se="http://schemas.microsoft.com/office/word/2015/wordml/symex" xmlns:wpg="http://schemas.microsoft.com/office/word/2010/wordprocessingGroup" xmlns:wpi="http://schemas.microsoft.com/office/word/2010/wordprocessingInk" xmlns:wne="http://schemas.microsoft.com/office/word/2006/wordml" xmlns:wps="http://schemas.microsoft.com/office/word/2010/wordprocessingShape" mc:Ignorable="w14 w15 w16se w16cid w16 w16cex w16sdtdh w16sdtfl w16du wp14">
+<w:document xmlns:wpc="http://schemas.microsoft.com/office/word/2010/wordprocessingCanvas" xmlns:cx="http://schemas.microsoft.com/office/drawing/2014/chartex" xmlns:cx1="http://schemas.microsoft.com/office/drawing/2015/9/8/chartex" xmlns:cx2="http://schemas.microsoft.com/office/drawing/2015/10/21/chartex" xmlns:cx3="http://schemas.microsoft.com/office/drawing/2016/5/9/chartex" xmlns:cx4="http://schemas.microsoft.com/office/drawing/2016/5/10/chartex" xmlns:cx5="http://schemas.microsoft.com/office/drawing/2016/5/11/chartex" xmlns:cx6="http://schemas.microsoft.com/office/drawing/2016/5/12/chartex" xmlns:cx7="http://schemas.microsoft.com/office/drawing/2016/5/13/chartex" xmlns:cx8="http://schemas.microsoft.com/office/drawing/2016/5/14/chartex" xmlns:mc="http://schemas.openxmlformats.org/markup-compatibility/2006" xmlns:aink="http://schemas.microsoft.com/office/drawing/2016/ink" xmlns:am3d="http://schemas.microsoft.com/office/drawing/2017/model3d" xmlns:o="urn:schemas-microsoft-com:office:office" xmlns:oel="http://schemas.microsoft.com/office/2019/extlst" xmlns:r="http://schemas.openxmlformats.org/officeDocument/2006/relationships" xmlns:m="http://schemas.openxmlformats.org/officeDocument/2006/math" xmlns:v="urn:schemas-microsoft-com:vml" xmlns:wp14="http://schemas.microsoft.com/office/word/2010/wordprocessingDrawing" xmlns:wp="http://schemas.openxmlformats.org/drawingml/2006/wordprocessingDrawing" xmlns:w10="urn:schemas-microsoft-com:office:word" xmlns:w="http://schemas.openxmlformats.org/wordprocessingml/2006/main" xmlns:w14="http://schemas.microsoft.com/office/word/2010/wordml" xmlns:w15="http://schemas.microsoft.com/office/word/2012/wordml" xmlns:w16cei="http://schemas.microsoft.com/office/word/2026/wordml/cei" xmlns:w16cex="http://schemas.microsoft.com/office/word/2018/wordml/cex" xmlns:w16cid="http://schemas.microsoft.com/office/word/2016/wordml/cid" xmlns:w16="http://schemas.microsoft.com/office/word/2018/wordml" xmlns:w16du="http://schemas.microsoft.com/office/word/2023/wordml/word16du" xmlns:w16sdtdh="http://schemas.microsoft.com/office/word/2020/wordml/sdtdatahash" xmlns:w16sdtfl="http://schemas.microsoft.com/office/word/2024/wordml/sdtformatlock" xmlns:w16se="http://schemas.microsoft.com/office/word/2015/wordml/symex" xmlns:wpg="http://schemas.microsoft.com/office/word/2010/wordprocessingGroup" xmlns:wpi="http://schemas.microsoft.com/office/word/2010/wordprocessingInk" xmlns:wne="http://schemas.microsoft.com/office/word/2006/wordml" xmlns:wps="http://schemas.microsoft.com/office/word/2010/wordprocessingShape" mc:Ignorable="w14 w15 w16se w16cid w16 w16cex w16sdtdh w16sdtfl w16du wp14">
   <w:body>
     <w:p>
       <w:pPr>
@@ -859,19 +859,36 @@
                 <w:sz w:val="20"/>
                 <w:szCs w:val="20"/>
               </w:rPr>
-              <w:t>• Lier l'édition des données adhérents à la base de données de l'APS</w:t>
-            </w:r>
-          </w:p>
-          <w:p>
-            <w:r>
-              <w:rPr>
-                <w:sz w:val="20"/>
-                <w:szCs w:val="20"/>
-              </w:rPr>
-              <w:t>• Permettre l'impression des simulations par les gestionnaires</w:t>
-            </w:r>
-            <w:r>
-              <w:rPr>
+              <w:t xml:space="preserve">• </w:t>
+            </w:r>
+            <w:r>
+              <w:rPr>
+                <w:color w:val="8DD873" w:themeColor="accent6" w:themeTint="99"/>
+                <w:sz w:val="20"/>
+                <w:szCs w:val="20"/>
+              </w:rPr>
+              <w:t>Lier l'édition des données adhérents à la base de données de l'APS</w:t>
+            </w:r>
+          </w:p>
+          <w:p>
+            <w:r>
+              <w:rPr>
+                <w:sz w:val="20"/>
+                <w:szCs w:val="20"/>
+              </w:rPr>
+              <w:t xml:space="preserve">• </w:t>
+            </w:r>
+            <w:r>
+              <w:rPr>
+                <w:color w:val="8DD873" w:themeColor="accent6" w:themeTint="99"/>
+                <w:sz w:val="20"/>
+                <w:szCs w:val="20"/>
+              </w:rPr>
+              <w:t>Permettre l'impression des simulations par les gestionnaires</w:t>
+            </w:r>
+            <w:r>
+              <w:rPr>
+                <w:color w:val="8DD873" w:themeColor="accent6" w:themeTint="99"/>
                 <w:sz w:val="20"/>
                 <w:szCs w:val="20"/>
               </w:rPr>
@@ -880,6 +897,7 @@
             <w:proofErr w:type="spellStart"/>
             <w:r>
               <w:rPr>
+                <w:color w:val="8DD873" w:themeColor="accent6" w:themeTint="99"/>
                 <w:sz w:val="20"/>
                 <w:szCs w:val="20"/>
               </w:rPr>
@@ -1350,7 +1368,15 @@
                 <w:sz w:val="20"/>
                 <w:szCs w:val="20"/>
               </w:rPr>
-              <w:t>• Vérifier les formules de calcul et les procédures de validation</w:t>
+              <w:t xml:space="preserve">• </w:t>
+            </w:r>
+            <w:r>
+              <w:rPr>
+                <w:color w:val="EE0000"/>
+                <w:sz w:val="20"/>
+                <w:szCs w:val="20"/>
+              </w:rPr>
+              <w:t>Vérifier les formules de calcul et les procédures de validation</w:t>
             </w:r>
           </w:p>
         </w:tc>
@@ -1703,7 +1729,7 @@
 </file>
 
 <file path=word/endnotes.xml><?xml version="1.0" encoding="utf-8"?>
-<w:endnotes xmlns:wpc="http://schemas.microsoft.com/office/word/2010/wordprocessingCanvas" xmlns:cx="http://schemas.microsoft.com/office/drawing/2014/chartex" xmlns:cx1="http://schemas.microsoft.com/office/drawing/2015/9/8/chartex" xmlns:cx2="http://schemas.microsoft.com/office/drawing/2015/10/21/chartex" xmlns:cx3="http://schemas.microsoft.com/office/drawing/2016/5/9/chartex" xmlns:cx4="http://schemas.microsoft.com/office/drawing/2016/5/10/chartex" xmlns:cx5="http://schemas.microsoft.com/office/drawing/2016/5/11/chartex" xmlns:cx6="http://schemas.microsoft.com/office/drawing/2016/5/12/chartex" xmlns:cx7="http://schemas.microsoft.com/office/drawing/2016/5/13/chartex" xmlns:cx8="http://schemas.microsoft.com/office/drawing/2016/5/14/chartex" xmlns:mc="http://schemas.openxmlformats.org/markup-compatibility/2006" xmlns:aink="http://schemas.microsoft.com/office/drawing/2016/ink" xmlns:am3d="http://schemas.microsoft.com/office/drawing/2017/model3d" xmlns:o="urn:schemas-microsoft-com:office:office" xmlns:oel="http://schemas.microsoft.com/office/2019/extlst" xmlns:r="http://schemas.openxmlformats.org/officeDocument/2006/relationships" xmlns:m="http://schemas.openxmlformats.org/officeDocument/2006/math" xmlns:v="urn:schemas-microsoft-com:vml" xmlns:wp14="http://schemas.microsoft.com/office/word/2010/wordprocessingDrawing" xmlns:wp="http://schemas.openxmlformats.org/drawingml/2006/wordprocessingDrawing" xmlns:w10="urn:schemas-microsoft-com:office:word" xmlns:w="http://schemas.openxmlformats.org/wordprocessingml/2006/main" xmlns:w14="http://schemas.microsoft.com/office/word/2010/wordml" xmlns:w15="http://schemas.microsoft.com/office/word/2012/wordml" xmlns:w16cex="http://schemas.microsoft.com/office/word/2018/wordml/cex" xmlns:w16cid="http://schemas.microsoft.com/office/word/2016/wordml/cid" xmlns:w16="http://schemas.microsoft.com/office/word/2018/wordml" xmlns:w16du="http://schemas.microsoft.com/office/word/2023/wordml/word16du" xmlns:w16sdtdh="http://schemas.microsoft.com/office/word/2020/wordml/sdtdatahash" xmlns:w16sdtfl="http://schemas.microsoft.com/office/word/2024/wordml/sdtformatlock" xmlns:w16se="http://schemas.microsoft.com/office/word/2015/wordml/symex" xmlns:wpg="http://schemas.microsoft.com/office/word/2010/wordprocessingGroup" xmlns:wpi="http://schemas.microsoft.com/office/word/2010/wordprocessingInk" xmlns:wne="http://schemas.microsoft.com/office/word/2006/wordml" xmlns:wps="http://schemas.microsoft.com/office/word/2010/wordprocessingShape" mc:Ignorable="w14 w15 w16se w16cid w16 w16cex w16sdtdh w16sdtfl w16du wp14">
+<w:endnotes xmlns:wpc="http://schemas.microsoft.com/office/word/2010/wordprocessingCanvas" xmlns:cx="http://schemas.microsoft.com/office/drawing/2014/chartex" xmlns:cx1="http://schemas.microsoft.com/office/drawing/2015/9/8/chartex" xmlns:cx2="http://schemas.microsoft.com/office/drawing/2015/10/21/chartex" xmlns:cx3="http://schemas.microsoft.com/office/drawing/2016/5/9/chartex" xmlns:cx4="http://schemas.microsoft.com/office/drawing/2016/5/10/chartex" xmlns:cx5="http://schemas.microsoft.com/office/drawing/2016/5/11/chartex" xmlns:cx6="http://schemas.microsoft.com/office/drawing/2016/5/12/chartex" xmlns:cx7="http://schemas.microsoft.com/office/drawing/2016/5/13/chartex" xmlns:cx8="http://schemas.microsoft.com/office/drawing/2016/5/14/chartex" xmlns:mc="http://schemas.openxmlformats.org/markup-compatibility/2006" xmlns:aink="http://schemas.microsoft.com/office/drawing/2016/ink" xmlns:am3d="http://schemas.microsoft.com/office/drawing/2017/model3d" xmlns:o="urn:schemas-microsoft-com:office:office" xmlns:oel="http://schemas.microsoft.com/office/2019/extlst" xmlns:r="http://schemas.openxmlformats.org/officeDocument/2006/relationships" xmlns:m="http://schemas.openxmlformats.org/officeDocument/2006/math" xmlns:v="urn:schemas-microsoft-com:vml" xmlns:wp14="http://schemas.microsoft.com/office/word/2010/wordprocessingDrawing" xmlns:wp="http://schemas.openxmlformats.org/drawingml/2006/wordprocessingDrawing" xmlns:w10="urn:schemas-microsoft-com:office:word" xmlns:w="http://schemas.openxmlformats.org/wordprocessingml/2006/main" xmlns:w14="http://schemas.microsoft.com/office/word/2010/wordml" xmlns:w15="http://schemas.microsoft.com/office/word/2012/wordml" xmlns:w16cei="http://schemas.microsoft.com/office/word/2026/wordml/cei" xmlns:w16cex="http://schemas.microsoft.com/office/word/2018/wordml/cex" xmlns:w16cid="http://schemas.microsoft.com/office/word/2016/wordml/cid" xmlns:w16="http://schemas.microsoft.com/office/word/2018/wordml" xmlns:w16du="http://schemas.microsoft.com/office/word/2023/wordml/word16du" xmlns:w16sdtdh="http://schemas.microsoft.com/office/word/2020/wordml/sdtdatahash" xmlns:w16sdtfl="http://schemas.microsoft.com/office/word/2024/wordml/sdtformatlock" xmlns:w16se="http://schemas.microsoft.com/office/word/2015/wordml/symex" xmlns:wpg="http://schemas.microsoft.com/office/word/2010/wordprocessingGroup" xmlns:wpi="http://schemas.microsoft.com/office/word/2010/wordprocessingInk" xmlns:wne="http://schemas.microsoft.com/office/word/2006/wordml" xmlns:wps="http://schemas.microsoft.com/office/word/2010/wordprocessingShape" mc:Ignorable="w14 w15 w16se w16cid w16 w16cex w16sdtdh w16sdtfl w16du wp14">
   <w:endnote w:type="separator" w:id="-1">
     <w:p>
       <w:r>
@@ -1722,7 +1748,7 @@
 </file>
 
 <file path=word/footer1.xml><?xml version="1.0" encoding="utf-8"?>
-<w:ftr xmlns:wpc="http://schemas.microsoft.com/office/word/2010/wordprocessingCanvas" xmlns:cx="http://schemas.microsoft.com/office/drawing/2014/chartex" xmlns:cx1="http://schemas.microsoft.com/office/drawing/2015/9/8/chartex" xmlns:cx2="http://schemas.microsoft.com/office/drawing/2015/10/21/chartex" xmlns:cx3="http://schemas.microsoft.com/office/drawing/2016/5/9/chartex" xmlns:cx4="http://schemas.microsoft.com/office/drawing/2016/5/10/chartex" xmlns:cx5="http://schemas.microsoft.com/office/drawing/2016/5/11/chartex" xmlns:cx6="http://schemas.microsoft.com/office/drawing/2016/5/12/chartex" xmlns:cx7="http://schemas.microsoft.com/office/drawing/2016/5/13/chartex" xmlns:cx8="http://schemas.microsoft.com/office/drawing/2016/5/14/chartex" xmlns:mc="http://schemas.openxmlformats.org/markup-compatibility/2006" xmlns:aink="http://schemas.microsoft.com/office/drawing/2016/ink" xmlns:am3d="http://schemas.microsoft.com/office/drawing/2017/model3d" xmlns:o="urn:schemas-microsoft-com:office:office" xmlns:oel="http://schemas.microsoft.com/office/2019/extlst" xmlns:r="http://schemas.openxmlformats.org/officeDocument/2006/relationships" xmlns:m="http://schemas.openxmlformats.org/officeDocument/2006/math" xmlns:v="urn:schemas-microsoft-com:vml" xmlns:wp14="http://schemas.microsoft.com/office/word/2010/wordprocessingDrawing" xmlns:wp="http://schemas.openxmlformats.org/drawingml/2006/wordprocessingDrawing" xmlns:w10="urn:schemas-microsoft-com:office:word" xmlns:w="http://schemas.openxmlformats.org/wordprocessingml/2006/main" xmlns:w14="http://schemas.microsoft.com/office/word/2010/wordml" xmlns:w15="http://schemas.microsoft.com/office/word/2012/wordml" xmlns:w16cex="http://schemas.microsoft.com/office/word/2018/wordml/cex" xmlns:w16cid="http://schemas.microsoft.com/office/word/2016/wordml/cid" xmlns:w16="http://schemas.microsoft.com/office/word/2018/wordml" xmlns:w16du="http://schemas.microsoft.com/office/word/2023/wordml/word16du" xmlns:w16sdtdh="http://schemas.microsoft.com/office/word/2020/wordml/sdtdatahash" xmlns:w16sdtfl="http://schemas.microsoft.com/office/word/2024/wordml/sdtformatlock" xmlns:w16se="http://schemas.microsoft.com/office/word/2015/wordml/symex" xmlns:wpg="http://schemas.microsoft.com/office/word/2010/wordprocessingGroup" xmlns:wpi="http://schemas.microsoft.com/office/word/2010/wordprocessingInk" xmlns:wne="http://schemas.microsoft.com/office/word/2006/wordml" xmlns:wps="http://schemas.microsoft.com/office/word/2010/wordprocessingShape" mc:Ignorable="w14 w15 w16se w16cid w16 w16cex w16sdtdh w16sdtfl w16du wp14">
+<w:ftr xmlns:wpc="http://schemas.microsoft.com/office/word/2010/wordprocessingCanvas" xmlns:cx="http://schemas.microsoft.com/office/drawing/2014/chartex" xmlns:cx1="http://schemas.microsoft.com/office/drawing/2015/9/8/chartex" xmlns:cx2="http://schemas.microsoft.com/office/drawing/2015/10/21/chartex" xmlns:cx3="http://schemas.microsoft.com/office/drawing/2016/5/9/chartex" xmlns:cx4="http://schemas.microsoft.com/office/drawing/2016/5/10/chartex" xmlns:cx5="http://schemas.microsoft.com/office/drawing/2016/5/11/chartex" xmlns:cx6="http://schemas.microsoft.com/office/drawing/2016/5/12/chartex" xmlns:cx7="http://schemas.microsoft.com/office/drawing/2016/5/13/chartex" xmlns:cx8="http://schemas.microsoft.com/office/drawing/2016/5/14/chartex" xmlns:mc="http://schemas.openxmlformats.org/markup-compatibility/2006" xmlns:aink="http://schemas.microsoft.com/office/drawing/2016/ink" xmlns:am3d="http://schemas.microsoft.com/office/drawing/2017/model3d" xmlns:o="urn:schemas-microsoft-com:office:office" xmlns:oel="http://schemas.microsoft.com/office/2019/extlst" xmlns:r="http://schemas.openxmlformats.org/officeDocument/2006/relationships" xmlns:m="http://schemas.openxmlformats.org/officeDocument/2006/math" xmlns:v="urn:schemas-microsoft-com:vml" xmlns:wp14="http://schemas.microsoft.com/office/word/2010/wordprocessingDrawing" xmlns:wp="http://schemas.openxmlformats.org/drawingml/2006/wordprocessingDrawing" xmlns:w10="urn:schemas-microsoft-com:office:word" xmlns:w="http://schemas.openxmlformats.org/wordprocessingml/2006/main" xmlns:w14="http://schemas.microsoft.com/office/word/2010/wordml" xmlns:w15="http://schemas.microsoft.com/office/word/2012/wordml" xmlns:w16cei="http://schemas.microsoft.com/office/word/2026/wordml/cei" xmlns:w16cex="http://schemas.microsoft.com/office/word/2018/wordml/cex" xmlns:w16cid="http://schemas.microsoft.com/office/word/2016/wordml/cid" xmlns:w16="http://schemas.microsoft.com/office/word/2018/wordml" xmlns:w16du="http://schemas.microsoft.com/office/word/2023/wordml/word16du" xmlns:w16sdtdh="http://schemas.microsoft.com/office/word/2020/wordml/sdtdatahash" xmlns:w16sdtfl="http://schemas.microsoft.com/office/word/2024/wordml/sdtformatlock" xmlns:w16se="http://schemas.microsoft.com/office/word/2015/wordml/symex" xmlns:wpg="http://schemas.microsoft.com/office/word/2010/wordprocessingGroup" xmlns:wpi="http://schemas.microsoft.com/office/word/2010/wordprocessingInk" xmlns:wne="http://schemas.microsoft.com/office/word/2006/wordml" xmlns:wps="http://schemas.microsoft.com/office/word/2010/wordprocessingShape" mc:Ignorable="w14 w15 w16se w16cid w16 w16cex w16sdtdh w16sdtfl w16du wp14">
   <w:p>
     <w:pPr>
       <w:pBdr>
@@ -1783,7 +1809,7 @@
 </file>
 
 <file path=word/footnotes.xml><?xml version="1.0" encoding="utf-8"?>
-<w:footnotes xmlns:wpc="http://schemas.microsoft.com/office/word/2010/wordprocessingCanvas" xmlns:cx="http://schemas.microsoft.com/office/drawing/2014/chartex" xmlns:cx1="http://schemas.microsoft.com/office/drawing/2015/9/8/chartex" xmlns:cx2="http://schemas.microsoft.com/office/drawing/2015/10/21/chartex" xmlns:cx3="http://schemas.microsoft.com/office/drawing/2016/5/9/chartex" xmlns:cx4="http://schemas.microsoft.com/office/drawing/2016/5/10/chartex" xmlns:cx5="http://schemas.microsoft.com/office/drawing/2016/5/11/chartex" xmlns:cx6="http://schemas.microsoft.com/office/drawing/2016/5/12/chartex" xmlns:cx7="http://schemas.microsoft.com/office/drawing/2016/5/13/chartex" xmlns:cx8="http://schemas.microsoft.com/office/drawing/2016/5/14/chartex" xmlns:mc="http://schemas.openxmlformats.org/markup-compatibility/2006" xmlns:aink="http://schemas.microsoft.com/office/drawing/2016/ink" xmlns:am3d="http://schemas.microsoft.com/office/drawing/2017/model3d" xmlns:o="urn:schemas-microsoft-com:office:office" xmlns:oel="http://schemas.microsoft.com/office/2019/extlst" xmlns:r="http://schemas.openxmlformats.org/officeDocument/2006/relationships" xmlns:m="http://schemas.openxmlformats.org/officeDocument/2006/math" xmlns:v="urn:schemas-microsoft-com:vml" xmlns:wp14="http://schemas.microsoft.com/office/word/2010/wordprocessingDrawing" xmlns:wp="http://schemas.openxmlformats.org/drawingml/2006/wordprocessingDrawing" xmlns:w10="urn:schemas-microsoft-com:office:word" xmlns:w="http://schemas.openxmlformats.org/wordprocessingml/2006/main" xmlns:w14="http://schemas.microsoft.com/office/word/2010/wordml" xmlns:w15="http://schemas.microsoft.com/office/word/2012/wordml" xmlns:w16cex="http://schemas.microsoft.com/office/word/2018/wordml/cex" xmlns:w16cid="http://schemas.microsoft.com/office/word/2016/wordml/cid" xmlns:w16="http://schemas.microsoft.com/office/word/2018/wordml" xmlns:w16du="http://schemas.microsoft.com/office/word/2023/wordml/word16du" xmlns:w16sdtdh="http://schemas.microsoft.com/office/word/2020/wordml/sdtdatahash" xmlns:w16sdtfl="http://schemas.microsoft.com/office/word/2024/wordml/sdtformatlock" xmlns:w16se="http://schemas.microsoft.com/office/word/2015/wordml/symex" xmlns:wpg="http://schemas.microsoft.com/office/word/2010/wordprocessingGroup" xmlns:wpi="http://schemas.microsoft.com/office/word/2010/wordprocessingInk" xmlns:wne="http://schemas.microsoft.com/office/word/2006/wordml" xmlns:wps="http://schemas.microsoft.com/office/word/2010/wordprocessingShape" mc:Ignorable="w14 w15 w16se w16cid w16 w16cex w16sdtdh w16sdtfl w16du wp14">
+<w:footnotes xmlns:wpc="http://schemas.microsoft.com/office/word/2010/wordprocessingCanvas" xmlns:cx="http://schemas.microsoft.com/office/drawing/2014/chartex" xmlns:cx1="http://schemas.microsoft.com/office/drawing/2015/9/8/chartex" xmlns:cx2="http://schemas.microsoft.com/office/drawing/2015/10/21/chartex" xmlns:cx3="http://schemas.microsoft.com/office/drawing/2016/5/9/chartex" xmlns:cx4="http://schemas.microsoft.com/office/drawing/2016/5/10/chartex" xmlns:cx5="http://schemas.microsoft.com/office/drawing/2016/5/11/chartex" xmlns:cx6="http://schemas.microsoft.com/office/drawing/2016/5/12/chartex" xmlns:cx7="http://schemas.microsoft.com/office/drawing/2016/5/13/chartex" xmlns:cx8="http://schemas.microsoft.com/office/drawing/2016/5/14/chartex" xmlns:mc="http://schemas.openxmlformats.org/markup-compatibility/2006" xmlns:aink="http://schemas.microsoft.com/office/drawing/2016/ink" xmlns:am3d="http://schemas.microsoft.com/office/drawing/2017/model3d" xmlns:o="urn:schemas-microsoft-com:office:office" xmlns:oel="http://schemas.microsoft.com/office/2019/extlst" xmlns:r="http://schemas.openxmlformats.org/officeDocument/2006/relationships" xmlns:m="http://schemas.openxmlformats.org/officeDocument/2006/math" xmlns:v="urn:schemas-microsoft-com:vml" xmlns:wp14="http://schemas.microsoft.com/office/word/2010/wordprocessingDrawing" xmlns:wp="http://schemas.openxmlformats.org/drawingml/2006/wordprocessingDrawing" xmlns:w10="urn:schemas-microsoft-com:office:word" xmlns:w="http://schemas.openxmlformats.org/wordprocessingml/2006/main" xmlns:w14="http://schemas.microsoft.com/office/word/2010/wordml" xmlns:w15="http://schemas.microsoft.com/office/word/2012/wordml" xmlns:w16cei="http://schemas.microsoft.com/office/word/2026/wordml/cei" xmlns:w16cex="http://schemas.microsoft.com/office/word/2018/wordml/cex" xmlns:w16cid="http://schemas.microsoft.com/office/word/2016/wordml/cid" xmlns:w16="http://schemas.microsoft.com/office/word/2018/wordml" xmlns:w16du="http://schemas.microsoft.com/office/word/2023/wordml/word16du" xmlns:w16sdtdh="http://schemas.microsoft.com/office/word/2020/wordml/sdtdatahash" xmlns:w16sdtfl="http://schemas.microsoft.com/office/word/2024/wordml/sdtformatlock" xmlns:w16se="http://schemas.microsoft.com/office/word/2015/wordml/symex" xmlns:wpg="http://schemas.microsoft.com/office/word/2010/wordprocessingGroup" xmlns:wpi="http://schemas.microsoft.com/office/word/2010/wordprocessingInk" xmlns:wne="http://schemas.microsoft.com/office/word/2006/wordml" xmlns:wps="http://schemas.microsoft.com/office/word/2010/wordprocessingShape" mc:Ignorable="w14 w15 w16se w16cid w16 w16cex w16sdtdh w16sdtfl w16du wp14">
   <w:footnote w:type="separator" w:id="-1">
     <w:p>
       <w:r>
@@ -1802,7 +1828,7 @@
 </file>
 
 <file path=word/header1.xml><?xml version="1.0" encoding="utf-8"?>
-<w:hdr xmlns:wpc="http://schemas.microsoft.com/office/word/2010/wordprocessingCanvas" xmlns:cx="http://schemas.microsoft.com/office/drawing/2014/chartex" xmlns:cx1="http://schemas.microsoft.com/office/drawing/2015/9/8/chartex" xmlns:cx2="http://schemas.microsoft.com/office/drawing/2015/10/21/chartex" xmlns:cx3="http://schemas.microsoft.com/office/drawing/2016/5/9/chartex" xmlns:cx4="http://schemas.microsoft.com/office/drawing/2016/5/10/chartex" xmlns:cx5="http://schemas.microsoft.com/office/drawing/2016/5/11/chartex" xmlns:cx6="http://schemas.microsoft.com/office/drawing/2016/5/12/chartex" xmlns:cx7="http://schemas.microsoft.com/office/drawing/2016/5/13/chartex" xmlns:cx8="http://schemas.microsoft.com/office/drawing/2016/5/14/chartex" xmlns:mc="http://schemas.openxmlformats.org/markup-compatibility/2006" xmlns:aink="http://schemas.microsoft.com/office/drawing/2016/ink" xmlns:am3d="http://schemas.microsoft.com/office/drawing/2017/model3d" xmlns:o="urn:schemas-microsoft-com:office:office" xmlns:oel="http://schemas.microsoft.com/office/2019/extlst" xmlns:r="http://schemas.openxmlformats.org/officeDocument/2006/relationships" xmlns:m="http://schemas.openxmlformats.org/officeDocument/2006/math" xmlns:v="urn:schemas-microsoft-com:vml" xmlns:wp14="http://schemas.microsoft.com/office/word/2010/wordprocessingDrawing" xmlns:wp="http://schemas.openxmlformats.org/drawingml/2006/wordprocessingDrawing" xmlns:w10="urn:schemas-microsoft-com:office:word" xmlns:w="http://schemas.openxmlformats.org/wordprocessingml/2006/main" xmlns:w14="http://schemas.microsoft.com/office/word/2010/wordml" xmlns:w15="http://schemas.microsoft.com/office/word/2012/wordml" xmlns:w16cex="http://schemas.microsoft.com/office/word/2018/wordml/cex" xmlns:w16cid="http://schemas.microsoft.com/office/word/2016/wordml/cid" xmlns:w16="http://schemas.microsoft.com/office/word/2018/wordml" xmlns:w16du="http://schemas.microsoft.com/office/word/2023/wordml/word16du" xmlns:w16sdtdh="http://schemas.microsoft.com/office/word/2020/wordml/sdtdatahash" xmlns:w16sdtfl="http://schemas.microsoft.com/office/word/2024/wordml/sdtformatlock" xmlns:w16se="http://schemas.microsoft.com/office/word/2015/wordml/symex" xmlns:wpg="http://schemas.microsoft.com/office/word/2010/wordprocessingGroup" xmlns:wpi="http://schemas.microsoft.com/office/word/2010/wordprocessingInk" xmlns:wne="http://schemas.microsoft.com/office/word/2006/wordml" xmlns:wps="http://schemas.microsoft.com/office/word/2010/wordprocessingShape" mc:Ignorable="w14 w15 w16se w16cid w16 w16cex w16sdtdh w16sdtfl w16du wp14">
+<w:hdr xmlns:wpc="http://schemas.microsoft.com/office/word/2010/wordprocessingCanvas" xmlns:cx="http://schemas.microsoft.com/office/drawing/2014/chartex" xmlns:cx1="http://schemas.microsoft.com/office/drawing/2015/9/8/chartex" xmlns:cx2="http://schemas.microsoft.com/office/drawing/2015/10/21/chartex" xmlns:cx3="http://schemas.microsoft.com/office/drawing/2016/5/9/chartex" xmlns:cx4="http://schemas.microsoft.com/office/drawing/2016/5/10/chartex" xmlns:cx5="http://schemas.microsoft.com/office/drawing/2016/5/11/chartex" xmlns:cx6="http://schemas.microsoft.com/office/drawing/2016/5/12/chartex" xmlns:cx7="http://schemas.microsoft.com/office/drawing/2016/5/13/chartex" xmlns:cx8="http://schemas.microsoft.com/office/drawing/2016/5/14/chartex" xmlns:mc="http://schemas.openxmlformats.org/markup-compatibility/2006" xmlns:aink="http://schemas.microsoft.com/office/drawing/2016/ink" xmlns:am3d="http://schemas.microsoft.com/office/drawing/2017/model3d" xmlns:o="urn:schemas-microsoft-com:office:office" xmlns:oel="http://schemas.microsoft.com/office/2019/extlst" xmlns:r="http://schemas.openxmlformats.org/officeDocument/2006/relationships" xmlns:m="http://schemas.openxmlformats.org/officeDocument/2006/math" xmlns:v="urn:schemas-microsoft-com:vml" xmlns:wp14="http://schemas.microsoft.com/office/word/2010/wordprocessingDrawing" xmlns:wp="http://schemas.openxmlformats.org/drawingml/2006/wordprocessingDrawing" xmlns:w10="urn:schemas-microsoft-com:office:word" xmlns:w="http://schemas.openxmlformats.org/wordprocessingml/2006/main" xmlns:w14="http://schemas.microsoft.com/office/word/2010/wordml" xmlns:w15="http://schemas.microsoft.com/office/word/2012/wordml" xmlns:w16cei="http://schemas.microsoft.com/office/word/2026/wordml/cei" xmlns:w16cex="http://schemas.microsoft.com/office/word/2018/wordml/cex" xmlns:w16cid="http://schemas.microsoft.com/office/word/2016/wordml/cid" xmlns:w16="http://schemas.microsoft.com/office/word/2018/wordml" xmlns:w16du="http://schemas.microsoft.com/office/word/2023/wordml/word16du" xmlns:w16sdtdh="http://schemas.microsoft.com/office/word/2020/wordml/sdtdatahash" xmlns:w16sdtfl="http://schemas.microsoft.com/office/word/2024/wordml/sdtformatlock" xmlns:w16se="http://schemas.microsoft.com/office/word/2015/wordml/symex" xmlns:wpg="http://schemas.microsoft.com/office/word/2010/wordprocessingGroup" xmlns:wpi="http://schemas.microsoft.com/office/word/2010/wordprocessingInk" xmlns:wne="http://schemas.microsoft.com/office/word/2006/wordml" xmlns:wps="http://schemas.microsoft.com/office/word/2010/wordprocessingShape" mc:Ignorable="w14 w15 w16se w16cid w16 w16cex w16sdtdh w16sdtfl w16du wp14">
   <w:p>
     <w:pPr>
       <w:pBdr>
@@ -1825,7 +1851,7 @@
 </file>
 
 <file path=word/numbering.xml><?xml version="1.0" encoding="utf-8"?>
-<w:numbering xmlns:wpc="http://schemas.microsoft.com/office/word/2010/wordprocessingCanvas" xmlns:cx="http://schemas.microsoft.com/office/drawing/2014/chartex" xmlns:cx1="http://schemas.microsoft.com/office/drawing/2015/9/8/chartex" xmlns:cx2="http://schemas.microsoft.com/office/drawing/2015/10/21/chartex" xmlns:cx3="http://schemas.microsoft.com/office/drawing/2016/5/9/chartex" xmlns:cx4="http://schemas.microsoft.com/office/drawing/2016/5/10/chartex" xmlns:cx5="http://schemas.microsoft.com/office/drawing/2016/5/11/chartex" xmlns:cx6="http://schemas.microsoft.com/office/drawing/2016/5/12/chartex" xmlns:cx7="http://schemas.microsoft.com/office/drawing/2016/5/13/chartex" xmlns:cx8="http://schemas.microsoft.com/office/drawing/2016/5/14/chartex" xmlns:mc="http://schemas.openxmlformats.org/markup-compatibility/2006" xmlns:aink="http://schemas.microsoft.com/office/drawing/2016/ink" xmlns:am3d="http://schemas.microsoft.com/office/drawing/2017/model3d" xmlns:o="urn:schemas-microsoft-com:office:office" xmlns:oel="http://schemas.microsoft.com/office/2019/extlst" xmlns:r="http://schemas.openxmlformats.org/officeDocument/2006/relationships" xmlns:m="http://schemas.openxmlformats.org/officeDocument/2006/math" xmlns:v="urn:schemas-microsoft-com:vml" xmlns:wp14="http://schemas.microsoft.com/office/word/2010/wordprocessingDrawing" xmlns:wp="http://schemas.openxmlformats.org/drawingml/2006/wordprocessingDrawing" xmlns:w10="urn:schemas-microsoft-com:office:word" xmlns:w="http://schemas.openxmlformats.org/wordprocessingml/2006/main" xmlns:w14="http://schemas.microsoft.com/office/word/2010/wordml" xmlns:w15="http://schemas.microsoft.com/office/word/2012/wordml" xmlns:w16cex="http://schemas.microsoft.com/office/word/2018/wordml/cex" xmlns:w16cid="http://schemas.microsoft.com/office/word/2016/wordml/cid" xmlns:w16="http://schemas.microsoft.com/office/word/2018/wordml" xmlns:w16du="http://schemas.microsoft.com/office/word/2023/wordml/word16du" xmlns:w16sdtdh="http://schemas.microsoft.com/office/word/2020/wordml/sdtdatahash" xmlns:w16sdtfl="http://schemas.microsoft.com/office/word/2024/wordml/sdtformatlock" xmlns:w16se="http://schemas.microsoft.com/office/word/2015/wordml/symex" xmlns:wpg="http://schemas.microsoft.com/office/word/2010/wordprocessingGroup" xmlns:wpi="http://schemas.microsoft.com/office/word/2010/wordprocessingInk" xmlns:wne="http://schemas.microsoft.com/office/word/2006/wordml" xmlns:wps="http://schemas.microsoft.com/office/word/2010/wordprocessingShape" mc:Ignorable="w14 w15 w16se w16cid w16 w16cex w16sdtdh w16sdtfl w16du wp14">
+<w:numbering xmlns:wpc="http://schemas.microsoft.com/office/word/2010/wordprocessingCanvas" xmlns:cx="http://schemas.microsoft.com/office/drawing/2014/chartex" xmlns:cx1="http://schemas.microsoft.com/office/drawing/2015/9/8/chartex" xmlns:cx2="http://schemas.microsoft.com/office/drawing/2015/10/21/chartex" xmlns:cx3="http://schemas.microsoft.com/office/drawing/2016/5/9/chartex" xmlns:cx4="http://schemas.microsoft.com/office/drawing/2016/5/10/chartex" xmlns:cx5="http://schemas.microsoft.com/office/drawing/2016/5/11/chartex" xmlns:cx6="http://schemas.microsoft.com/office/drawing/2016/5/12/chartex" xmlns:cx7="http://schemas.microsoft.com/office/drawing/2016/5/13/chartex" xmlns:cx8="http://schemas.microsoft.com/office/drawing/2016/5/14/chartex" xmlns:mc="http://schemas.openxmlformats.org/markup-compatibility/2006" xmlns:aink="http://schemas.microsoft.com/office/drawing/2016/ink" xmlns:am3d="http://schemas.microsoft.com/office/drawing/2017/model3d" xmlns:o="urn:schemas-microsoft-com:office:office" xmlns:oel="http://schemas.microsoft.com/office/2019/extlst" xmlns:r="http://schemas.openxmlformats.org/officeDocument/2006/relationships" xmlns:m="http://schemas.openxmlformats.org/officeDocument/2006/math" xmlns:v="urn:schemas-microsoft-com:vml" xmlns:wp14="http://schemas.microsoft.com/office/word/2010/wordprocessingDrawing" xmlns:wp="http://schemas.openxmlformats.org/drawingml/2006/wordprocessingDrawing" xmlns:w10="urn:schemas-microsoft-com:office:word" xmlns:w="http://schemas.openxmlformats.org/wordprocessingml/2006/main" xmlns:w14="http://schemas.microsoft.com/office/word/2010/wordml" xmlns:w15="http://schemas.microsoft.com/office/word/2012/wordml" xmlns:w16cei="http://schemas.microsoft.com/office/word/2026/wordml/cei" xmlns:w16cex="http://schemas.microsoft.com/office/word/2018/wordml/cex" xmlns:w16cid="http://schemas.microsoft.com/office/word/2016/wordml/cid" xmlns:w16="http://schemas.microsoft.com/office/word/2018/wordml" xmlns:w16du="http://schemas.microsoft.com/office/word/2023/wordml/word16du" xmlns:w16sdtdh="http://schemas.microsoft.com/office/word/2020/wordml/sdtdatahash" xmlns:w16sdtfl="http://schemas.microsoft.com/office/word/2024/wordml/sdtformatlock" xmlns:w16se="http://schemas.microsoft.com/office/word/2015/wordml/symex" xmlns:wpg="http://schemas.microsoft.com/office/word/2010/wordprocessingGroup" xmlns:wpi="http://schemas.microsoft.com/office/word/2010/wordprocessingInk" xmlns:wne="http://schemas.microsoft.com/office/word/2006/wordml" xmlns:wps="http://schemas.microsoft.com/office/word/2010/wordprocessingShape" mc:Ignorable="w14 w15 w16se w16cid w16 w16cex w16sdtdh w16sdtfl w16du wp14">
   <w:abstractNum w:abstractNumId="0" w15:restartNumberingAfterBreak="0">
     <w:nsid w:val="2C155FD5"/>
     <w:multiLevelType w:val="hybridMultilevel"/>

</xml_diff>

<commit_message>
Add ESR account statement PDF and adherent preview
</commit_message>
<xml_diff>
--- a/DOCUMENT ESR/COMPTE_RENDU REUNION_ESR_ (2).docx
+++ b/DOCUMENT ESR/COMPTE_RENDU REUNION_ESR_ (2).docx
@@ -776,7 +776,15 @@
                 <w:sz w:val="20"/>
                 <w:szCs w:val="20"/>
               </w:rPr>
-              <w:t>• Vérifier les formules intégrées pour le calcul des provisions mathématiques</w:t>
+              <w:t xml:space="preserve">• </w:t>
+            </w:r>
+            <w:r>
+              <w:rPr>
+                <w:color w:val="FFC000"/>
+                <w:sz w:val="20"/>
+                <w:szCs w:val="20"/>
+              </w:rPr>
+              <w:t>Vérifier les formules intégrées pour le calcul des provisions mathématiques</w:t>
             </w:r>
           </w:p>
         </w:tc>
@@ -854,6 +862,11 @@
             </w:tcMar>
           </w:tcPr>
           <w:p>
+            <w:pPr>
+              <w:rPr>
+                <w:color w:val="00B050"/>
+              </w:rPr>
+            </w:pPr>
             <w:r>
               <w:rPr>
                 <w:sz w:val="20"/>
@@ -863,7 +876,7 @@
             </w:r>
             <w:r>
               <w:rPr>
-                <w:color w:val="8DD873" w:themeColor="accent6" w:themeTint="99"/>
+                <w:color w:val="00B050"/>
                 <w:sz w:val="20"/>
                 <w:szCs w:val="20"/>
               </w:rPr>
@@ -873,22 +886,15 @@
           <w:p>
             <w:r>
               <w:rPr>
-                <w:sz w:val="20"/>
-                <w:szCs w:val="20"/>
-              </w:rPr>
-              <w:t xml:space="preserve">• </w:t>
-            </w:r>
-            <w:r>
-              <w:rPr>
-                <w:color w:val="8DD873" w:themeColor="accent6" w:themeTint="99"/>
-                <w:sz w:val="20"/>
-                <w:szCs w:val="20"/>
-              </w:rPr>
-              <w:t>Permettre l'impression des simulations par les gestionnaires</w:t>
-            </w:r>
-            <w:r>
-              <w:rPr>
-                <w:color w:val="8DD873" w:themeColor="accent6" w:themeTint="99"/>
+                <w:color w:val="00B050"/>
+                <w:sz w:val="20"/>
+                <w:szCs w:val="20"/>
+              </w:rPr>
+              <w:t>• Permettre l'impression des simulations par les gestionnaires</w:t>
+            </w:r>
+            <w:r>
+              <w:rPr>
+                <w:color w:val="00B050"/>
                 <w:sz w:val="20"/>
                 <w:szCs w:val="20"/>
               </w:rPr>
@@ -897,7 +903,7 @@
             <w:proofErr w:type="spellStart"/>
             <w:r>
               <w:rPr>
-                <w:color w:val="8DD873" w:themeColor="accent6" w:themeTint="99"/>
+                <w:color w:val="00B050"/>
                 <w:sz w:val="20"/>
                 <w:szCs w:val="20"/>
               </w:rPr>
@@ -998,8 +1004,14 @@
             </w:tcMar>
           </w:tcPr>
           <w:p>
-            <w:r>
-              <w:rPr>
+            <w:pPr>
+              <w:rPr>
+                <w:color w:val="00B050"/>
+              </w:rPr>
+            </w:pPr>
+            <w:r>
+              <w:rPr>
+                <w:color w:val="00B050"/>
                 <w:sz w:val="20"/>
                 <w:szCs w:val="20"/>
               </w:rPr>
@@ -1007,8 +1019,14 @@
             </w:r>
           </w:p>
           <w:p>
-            <w:r>
-              <w:rPr>
+            <w:pPr>
+              <w:rPr>
+                <w:color w:val="00B050"/>
+              </w:rPr>
+            </w:pPr>
+            <w:r>
+              <w:rPr>
+                <w:color w:val="00B050"/>
                 <w:sz w:val="20"/>
                 <w:szCs w:val="20"/>
               </w:rPr>
@@ -1021,10 +1039,19 @@
                 <w:sz w:val="20"/>
                 <w:szCs w:val="20"/>
               </w:rPr>
-              <w:t>• Proposer un reçu pour les paiements spontanés</w:t>
-            </w:r>
-            <w:r>
-              <w:rPr>
+              <w:t xml:space="preserve">• </w:t>
+            </w:r>
+            <w:r>
+              <w:rPr>
+                <w:color w:val="00B050"/>
+                <w:sz w:val="20"/>
+                <w:szCs w:val="20"/>
+              </w:rPr>
+              <w:t>Proposer un reçu pour les paiements spontanés</w:t>
+            </w:r>
+            <w:r>
+              <w:rPr>
+                <w:color w:val="00B050"/>
                 <w:sz w:val="20"/>
                 <w:szCs w:val="20"/>
               </w:rPr>
@@ -1033,6 +1060,7 @@
             <w:proofErr w:type="spellStart"/>
             <w:r>
               <w:rPr>
+                <w:color w:val="00B050"/>
                 <w:sz w:val="20"/>
                 <w:szCs w:val="20"/>
               </w:rPr>
@@ -1043,6 +1071,7 @@
           <w:p>
             <w:r>
               <w:rPr>
+                <w:color w:val="00B050"/>
                 <w:sz w:val="20"/>
                 <w:szCs w:val="20"/>
               </w:rPr>
@@ -1051,6 +1080,7 @@
             </w:r>
             <w:r>
               <w:rPr>
+                <w:color w:val="00B050"/>
                 <w:sz w:val="20"/>
                 <w:szCs w:val="20"/>
               </w:rPr>
@@ -1138,10 +1168,19 @@
                 <w:sz w:val="20"/>
                 <w:szCs w:val="20"/>
               </w:rPr>
-              <w:t>• Recadrer le module en fonction des cotisations-maladie versées à l'APS (rente viagère)</w:t>
-            </w:r>
-            <w:r>
-              <w:rPr>
+              <w:t xml:space="preserve">• </w:t>
+            </w:r>
+            <w:r>
+              <w:rPr>
+                <w:color w:val="00B050"/>
+                <w:sz w:val="20"/>
+                <w:szCs w:val="20"/>
+              </w:rPr>
+              <w:t>Recadrer le module en fonction des cotisations-maladie versées à l'APS (rente viagère)</w:t>
+            </w:r>
+            <w:r>
+              <w:rPr>
+                <w:color w:val="00B050"/>
                 <w:sz w:val="20"/>
                 <w:szCs w:val="20"/>
               </w:rPr>
@@ -1150,6 +1189,7 @@
             <w:proofErr w:type="gramStart"/>
             <w:r>
               <w:rPr>
+                <w:color w:val="00B050"/>
                 <w:sz w:val="20"/>
                 <w:szCs w:val="20"/>
               </w:rPr>
@@ -1158,6 +1198,7 @@
             <w:proofErr w:type="gramEnd"/>
             <w:r>
               <w:rPr>
+                <w:color w:val="00B050"/>
                 <w:sz w:val="20"/>
                 <w:szCs w:val="20"/>
               </w:rPr>
@@ -1250,12 +1291,14 @@
           <w:p>
             <w:pPr>
               <w:rPr>
+                <w:color w:val="00B050"/>
                 <w:sz w:val="20"/>
                 <w:szCs w:val="20"/>
               </w:rPr>
             </w:pPr>
             <w:r>
               <w:rPr>
+                <w:color w:val="00B050"/>
                 <w:sz w:val="20"/>
                 <w:szCs w:val="20"/>
               </w:rPr>
@@ -1265,14 +1308,21 @@
           <w:p>
             <w:pPr>
               <w:rPr>
+                <w:color w:val="00B050"/>
                 <w:sz w:val="20"/>
                 <w:szCs w:val="20"/>
               </w:rPr>
             </w:pPr>
           </w:p>
           <w:p>
-            <w:r>
-              <w:rPr>
+            <w:pPr>
+              <w:rPr>
+                <w:color w:val="8DD873" w:themeColor="accent6" w:themeTint="99"/>
+              </w:rPr>
+            </w:pPr>
+            <w:r>
+              <w:rPr>
+                <w:color w:val="00B050"/>
                 <w:sz w:val="20"/>
                 <w:szCs w:val="20"/>
               </w:rPr>
@@ -1363,6 +1413,13 @@
             </w:tcMar>
           </w:tcPr>
           <w:p>
+            <w:pPr>
+              <w:rPr>
+                <w:color w:val="EE0000"/>
+                <w:sz w:val="20"/>
+                <w:szCs w:val="20"/>
+              </w:rPr>
+            </w:pPr>
             <w:r>
               <w:rPr>
                 <w:sz w:val="20"/>
@@ -1377,6 +1434,25 @@
                 <w:szCs w:val="20"/>
               </w:rPr>
               <w:t>Vérifier les formules de calcul et les procédures de validation</w:t>
+            </w:r>
+          </w:p>
+          <w:p>
+            <w:pPr>
+              <w:rPr>
+                <w:color w:val="EE0000"/>
+                <w:sz w:val="20"/>
+                <w:szCs w:val="20"/>
+              </w:rPr>
+            </w:pPr>
+          </w:p>
+          <w:p>
+            <w:r>
+              <w:rPr>
+                <w:color w:val="4EA72E" w:themeColor="accent6"/>
+                <w:sz w:val="20"/>
+                <w:szCs w:val="20"/>
+              </w:rPr>
+              <w:t>Mettre cela en standby</w:t>
             </w:r>
           </w:p>
         </w:tc>

</xml_diff>

<commit_message>
Configure separate web and API launch targets and create missing admin
</commit_message>
<xml_diff>
--- a/DOCUMENT ESR/COMPTE_RENDU REUNION_ESR_ (2).docx
+++ b/DOCUMENT ESR/COMPTE_RENDU REUNION_ESR_ (2).docx
@@ -771,20 +771,18 @@
             </w:tcMar>
           </w:tcPr>
           <w:p>
-            <w:r>
-              <w:rPr>
-                <w:sz w:val="20"/>
-                <w:szCs w:val="20"/>
-              </w:rPr>
-              <w:t xml:space="preserve">• </w:t>
-            </w:r>
-            <w:r>
-              <w:rPr>
-                <w:color w:val="FFC000"/>
-                <w:sz w:val="20"/>
-                <w:szCs w:val="20"/>
-              </w:rPr>
-              <w:t>Vérifier les formules intégrées pour le calcul des provisions mathématiques</w:t>
+            <w:pPr>
+              <w:rPr>
+                <w:color w:val="4EA72E" w:themeColor="accent6"/>
+              </w:rPr>
+            </w:pPr>
+            <w:r>
+              <w:rPr>
+                <w:color w:val="4EA72E" w:themeColor="accent6"/>
+                <w:sz w:val="20"/>
+                <w:szCs w:val="20"/>
+              </w:rPr>
+              <w:t>• Vérifier les formules intégrées pour le calcul des provisions mathématiques</w:t>
             </w:r>
           </w:p>
         </w:tc>
@@ -1548,17 +1546,31 @@
             </w:tcMar>
           </w:tcPr>
           <w:p>
-            <w:r>
-              <w:rPr>
-                <w:sz w:val="20"/>
-                <w:szCs w:val="20"/>
-              </w:rPr>
-              <w:t>• Vérifier la liste et valider les états pertinents</w:t>
-            </w:r>
-          </w:p>
-          <w:p>
-            <w:r>
-              <w:rPr>
+            <w:pPr>
+              <w:rPr>
+                <w:color w:val="4EA72E" w:themeColor="accent6"/>
+              </w:rPr>
+            </w:pPr>
+            <w:r>
+              <w:rPr>
+                <w:sz w:val="20"/>
+                <w:szCs w:val="20"/>
+              </w:rPr>
+              <w:t xml:space="preserve">• </w:t>
+            </w:r>
+            <w:r>
+              <w:rPr>
+                <w:color w:val="4EA72E" w:themeColor="accent6"/>
+                <w:sz w:val="20"/>
+                <w:szCs w:val="20"/>
+              </w:rPr>
+              <w:t>Vérifier la liste et valider les états pertinents</w:t>
+            </w:r>
+          </w:p>
+          <w:p>
+            <w:r>
+              <w:rPr>
+                <w:color w:val="4EA72E" w:themeColor="accent6"/>
                 <w:sz w:val="20"/>
                 <w:szCs w:val="20"/>
               </w:rPr>

</xml_diff>